<commit_message>
docs: rewrite README in English, remove image references, and update help docs
</commit_message>
<xml_diff>
--- a/docs/ProtocolDesign_帮助文档.docx
+++ b/docs/ProtocolDesign_帮助文档.docx
@@ -12,21 +12,7 @@
           <w:rFonts w:ascii="Arial" w:hAnsi="Arial" w:eastAsia="微软雅黑"/>
           <w:b w:val="0"/>
         </w:rPr>
-        <w:t>ProtocolDesign</w:t>
-      </w:r>
-    </w:p>
-    <w:p>
-      <w:pPr>
-        <w:jc w:val="center"/>
-      </w:pPr>
-      <w:r>
-        <w:rPr>
-          <w:rFonts w:ascii="Arial" w:hAnsi="Arial" w:eastAsia="微软雅黑"/>
-          <w:b w:val="0"/>
-          <w:color w:val="1F4E79"/>
-          <w:sz w:val="28"/>
-        </w:rPr>
-        <w:t>研案智构——AI辅助临床研究方案构建系统</w:t>
+        <w:t>研案智构——临床研究方案辅助构建系统（ProtocolDesign）</w:t>
       </w:r>
     </w:p>
     <w:p>
@@ -40,7 +26,7 @@
           <w:color w:val="486575"/>
           <w:sz w:val="24"/>
         </w:rPr>
-        <w:t>AI辅助临床研究方案构建系统</w:t>
+        <w:t>ProtocolDesign</w:t>
       </w:r>
     </w:p>
     <w:p>
@@ -232,7 +218,7 @@
               </w:rPr>
               <w:t>Email: yangpluszhu@sina.com</w:t>
               <w:br/>
-              <w:t>GitHub: https://github.com/yangpluszhu</w:t>
+              <w:t>GitHub: https://github.com/yangpluszhu/ProtocolDesign</w:t>
             </w:r>
           </w:p>
         </w:tc>
@@ -273,7 +259,7 @@
                 <w:rFonts w:ascii="Arial" w:hAnsi="Arial" w:eastAsia="微软雅黑"/>
                 <w:sz w:val="19"/>
               </w:rPr>
-              <w:t>2026-05-21 10:04</w:t>
+              <w:t>2026-06-11 16:51</w:t>
             </w:r>
           </w:p>
         </w:tc>
@@ -368,7 +354,7 @@
       <w:r>
         <w:drawing>
           <wp:inline xmlns:a="http://schemas.openxmlformats.org/drawingml/2006/main" xmlns:pic="http://schemas.openxmlformats.org/drawingml/2006/picture">
-            <wp:extent cx="5903999" cy="4186472"/>
+            <wp:extent cx="5903999" cy="6736511"/>
             <wp:docPr id="1" name="Picture 1"/>
             <wp:cNvGraphicFramePr>
               <a:graphicFrameLocks noChangeAspect="1"/>
@@ -389,7 +375,7 @@
                   <pic:spPr>
                     <a:xfrm>
                       <a:off x="0" y="0"/>
-                      <a:ext cx="5903999" cy="4186472"/>
+                      <a:ext cx="5903999" cy="6736511"/>
                     </a:xfrm>
                     <a:prstGeom prst="rect"/>
                   </pic:spPr>
@@ -411,7 +397,7 @@
           <w:color w:val="5A5A5A"/>
           <w:sz w:val="18"/>
         </w:rPr>
-        <w:t>图 1  ProtocolDesign（研案智构——AI辅助临床研究方案构建系统）主界面及关键操作区域</w:t>
+        <w:t>图 1  研案智构——临床研究方案辅助构建系统（ProtocolDesign） 主界面及关键操作区域</w:t>
       </w:r>
     </w:p>
     <w:tbl>
@@ -1105,7 +1091,7 @@
           <w:rFonts w:ascii="Arial" w:hAnsi="Arial" w:eastAsia="微软雅黑"/>
           <w:sz w:val="32"/>
         </w:rPr>
-        <w:t>三、11 步完成第一次生成</w:t>
+        <w:t>三、9 步完成第一次生成</w:t>
       </w:r>
     </w:p>
     <w:p>
@@ -1201,7 +1187,7 @@
           <w:rFonts w:ascii="Arial" w:hAnsi="Arial" w:eastAsia="微软雅黑"/>
           <w:sz w:val="26"/>
         </w:rPr>
-        <w:t>第 5 步：填写 base_url</w:t>
+        <w:t>第 5 步：填写模型接口信息</w:t>
       </w:r>
     </w:p>
     <w:p>
@@ -1210,7 +1196,7 @@
           <w:rFonts w:ascii="Arial" w:hAnsi="Arial" w:eastAsia="微软雅黑"/>
           <w:b w:val="0"/>
         </w:rPr>
-        <w:t>base_url 是模型平台的 OpenAI 兼容接口地址。例如某些平台使用 https://api.example.com/v1。软件会自动拼接 /chat/completions；如果您填写的地址已经以 /chat/completions 结尾，软件会直接使用该地址。</w:t>
+        <w:t>依次填写或确认 base_url、api_key 和模型名称。base_url 是 OpenAI 兼容接口地址；api_key 是平台访问密钥，可按需勾选“显示 api_key”或“本地保存 api_key”；模型名称可从下拉框选择，也可手动输入平台实际支持的模型名。</w:t>
       </w:r>
     </w:p>
     <w:p>
@@ -1222,49 +1208,7 @@
           <w:rFonts w:ascii="Arial" w:hAnsi="Arial" w:eastAsia="微软雅黑"/>
           <w:sz w:val="26"/>
         </w:rPr>
-        <w:t>第 6 步：填写 api_key</w:t>
-      </w:r>
-    </w:p>
-    <w:p>
-      <w:r>
-        <w:rPr>
-          <w:rFonts w:ascii="Arial" w:hAnsi="Arial" w:eastAsia="微软雅黑"/>
-          <w:b w:val="0"/>
-        </w:rPr>
-        <w:t>api_key 是模型平台提供的访问密钥。复制时不要多复制空格或换行。填写后默认不可见，如需核对可勾选“显示 api_key”。如果希望下次自动使用，可勾选“本地保存 api_key”；如果不勾选，软件会删除当前提供商的本地保存项，下次仍需重新输入。</w:t>
-      </w:r>
-    </w:p>
-    <w:p>
-      <w:pPr>
-        <w:pStyle w:val="Heading2"/>
-      </w:pPr>
-      <w:r>
-        <w:rPr>
-          <w:rFonts w:ascii="Arial" w:hAnsi="Arial" w:eastAsia="微软雅黑"/>
-          <w:sz w:val="26"/>
-        </w:rPr>
-        <w:t>第 7 步：选择或填写模型名称</w:t>
-      </w:r>
-    </w:p>
-    <w:p>
-      <w:r>
-        <w:rPr>
-          <w:rFonts w:ascii="Arial" w:hAnsi="Arial" w:eastAsia="微软雅黑"/>
-          <w:b w:val="0"/>
-        </w:rPr>
-        <w:t>模型名称可以从下拉框直接选择，也可以手动输入平台实际支持的模型名。建议优先选择带 thinking、reasoner、pro、GLM-4.5/4.7/5、MiMo-V2.5/V2 等具备推理能力的模型。若模型名错误，接口通常会返回 400 或模型不存在错误。</w:t>
-      </w:r>
-    </w:p>
-    <w:p>
-      <w:pPr>
-        <w:pStyle w:val="Heading2"/>
-      </w:pPr>
-      <w:r>
-        <w:rPr>
-          <w:rFonts w:ascii="Arial" w:hAnsi="Arial" w:eastAsia="微软雅黑"/>
-          <w:sz w:val="26"/>
-        </w:rPr>
-        <w:t>第 8 步：选择输出目录</w:t>
+        <w:t>第 6 步：选择输出目录</w:t>
       </w:r>
     </w:p>
     <w:p>
@@ -1285,7 +1229,7 @@
           <w:rFonts w:ascii="Arial" w:hAnsi="Arial" w:eastAsia="微软雅黑"/>
           <w:sz w:val="26"/>
         </w:rPr>
-        <w:t>第 9 步：填写输出文件名</w:t>
+        <w:t>第 7 步：填写输出文件名</w:t>
       </w:r>
     </w:p>
     <w:p>
@@ -1306,7 +1250,7 @@
           <w:rFonts w:ascii="Arial" w:hAnsi="Arial" w:eastAsia="微软雅黑"/>
           <w:sz w:val="26"/>
         </w:rPr>
-        <w:t>第 10 步：点击确定生成方案</w:t>
+        <w:t>第 8 步：点击确定生成方案</w:t>
       </w:r>
     </w:p>
     <w:p>
@@ -1327,7 +1271,7 @@
           <w:rFonts w:ascii="Arial" w:hAnsi="Arial" w:eastAsia="微软雅黑"/>
           <w:sz w:val="26"/>
         </w:rPr>
-        <w:t>第 11 步：查看结果并人工复核</w:t>
+        <w:t>第 9 步：查看结果并人工复核</w:t>
       </w:r>
     </w:p>
     <w:p>
@@ -1336,7 +1280,7 @@
           <w:rFonts w:ascii="Arial" w:hAnsi="Arial" w:eastAsia="微软雅黑"/>
           <w:b w:val="0"/>
         </w:rPr>
-        <w:t>完成后，输出目录中会出现研究方案 DOCX 和同名的运行简报 txt。请打开 Word 文档检查目录、章节、附表和所有关键方法学内容，并按研究团队要求进行人工复核。</w:t>
+        <w:t>完成后，输出目录中会出现研究方案 DOCX 和同名的运行简报 txt；如生成失败，程序目录会额外写出 ProtocolDesign_error.log 供排查。请打开 Word 文档检查目录、章节、附表和所有关键方法学内容，并按研究团队要求进行人工复核。</w:t>
       </w:r>
     </w:p>
     <w:p>
@@ -1608,7 +1552,7 @@
                 <w:rFonts w:ascii="Arial" w:hAnsi="Arial" w:eastAsia="微软雅黑"/>
                 <w:sz w:val="19"/>
               </w:rPr>
-              <w:t>自动使用 temperature=0.6、禁用思考模式并设置较大的输出 token 预算；对 Kimi 采用封面摘要、章节分批生成后本地组装的流程；流式响应强制按 UTF-8 解码；如未返回最终正文，会继续尝试 JSON 模式和非流式禁用思考模式。</w:t>
+              <w:t>自动使用 temperature=0.6、禁用思考模式并设置较大的输出 token 预算；对 Kimi 采用封面摘要、章节分批生成后本地组装的流程；流式响应强制按 UTF-8 解码；封面摘要阶段如未返回最终正文，会继续尝试 JSON 模式和非流式禁用思考模式；章节分批阶段会继续尝试非流式禁用思考模式。</w:t>
             </w:r>
           </w:p>
         </w:tc>
@@ -3294,7 +3238,7 @@
         <w:rFonts w:ascii="Arial" w:hAnsi="Arial" w:eastAsia="微软雅黑"/>
         <w:sz w:val="18"/>
       </w:rPr>
-      <w:t>ProtocolDesign（研案智构——AI辅助临床研究方案构建系统）帮助文档 | V1.0</w:t>
+      <w:t>研案智构——临床研究方案辅助构建系统（ProtocolDesign） 帮助文档 | V1.0</w:t>
     </w:r>
   </w:p>
 </w:hdr>

</xml_diff>

<commit_message>
chore: refresh product name to 临床研究方案辅助构建系统 and sync docs
- Rename APP_NAME_CN in src/ProtocolDesign.py and src/build_help_docx.py
  (drop the "研案智构——" prefix)
- Regenerate help docs (md/docx/pdf) and main UI screenshot for the new name
- Rewrite README in English (concise version) and remove embedded screenshot
</commit_message>
<xml_diff>
--- a/docs/ProtocolDesign_帮助文档.docx
+++ b/docs/ProtocolDesign_帮助文档.docx
@@ -12,7 +12,7 @@
           <w:rFonts w:ascii="Arial" w:hAnsi="Arial" w:eastAsia="微软雅黑"/>
           <w:b w:val="0"/>
         </w:rPr>
-        <w:t>研案智构——临床研究方案辅助构建系统（ProtocolDesign）</w:t>
+        <w:t>临床研究方案辅助构建系统（ProtocolDesign）</w:t>
       </w:r>
     </w:p>
     <w:p>
@@ -259,7 +259,7 @@
                 <w:rFonts w:ascii="Arial" w:hAnsi="Arial" w:eastAsia="微软雅黑"/>
                 <w:sz w:val="19"/>
               </w:rPr>
-              <w:t>2026-06-11 16:51</w:t>
+              <w:t>2026-07-02 20:20</w:t>
             </w:r>
           </w:p>
         </w:tc>
@@ -397,7 +397,7 @@
           <w:color w:val="5A5A5A"/>
           <w:sz w:val="18"/>
         </w:rPr>
-        <w:t>图 1  研案智构——临床研究方案辅助构建系统（ProtocolDesign） 主界面及关键操作区域</w:t>
+        <w:t>图 1  临床研究方案辅助构建系统（ProtocolDesign） 主界面及关键操作区域</w:t>
       </w:r>
     </w:p>
     <w:tbl>
@@ -3238,7 +3238,7 @@
         <w:rFonts w:ascii="Arial" w:hAnsi="Arial" w:eastAsia="微软雅黑"/>
         <w:sz w:val="18"/>
       </w:rPr>
-      <w:t>研案智构——临床研究方案辅助构建系统（ProtocolDesign） 帮助文档 | V1.0</w:t>
+      <w:t>临床研究方案辅助构建系统（ProtocolDesign） 帮助文档 | V1.0</w:t>
     </w:r>
   </w:p>
 </w:hdr>

</xml_diff>